<commit_message>
refactor: migrate to structured RAG + acto engine architecture
</commit_message>
<xml_diff>
--- a/app/templates/plantilla_notarial.docx
+++ b/app/templates/plantilla_notarial.docx
@@ -23,132 +23,6 @@
         <w:rPr>
           <w:rtl w:val="0"/>
         </w:rPr>
-      </w:r>
-    </w:p>
-    <w:p>
-      <w:pPr>
-        <w:tabs>
-          <w:tab w:val="right" w:leader="none" w:pos="7920"/>
-          <w:tab w:val="left" w:leader="none" w:pos="8784"/>
-        </w:tabs>
-        <w:spacing w:after="240" w:before="240" w:line="240" w:lineRule="auto"/>
-        <w:jc w:val="both"/>
-        <w:rPr>
-          <w:b w:val="1"/>
-          <w:bCs w:val="1"/>
-          <w:sz w:val="24"/>
-          <w:szCs w:val="24"/>
-        </w:rPr>
-      </w:pPr>
-      <w:r>
-        <w:rPr>
-          <w:b w:val="1"/>
-          <w:bCs w:val="1"/>
-          <w:sz w:val="24"/>
-          <w:szCs w:val="24"/>
-          <w:rtl w:val="0"/>
-        </w:rPr>
-        <w:t xml:space="preserve">_________</w:t>
-      </w:r>
-    </w:p>
-    <w:p>
-      <w:pPr>
-        <w:tabs>
-          <w:tab w:val="right" w:leader="none" w:pos="7920"/>
-          <w:tab w:val="left" w:leader="none" w:pos="8784"/>
-        </w:tabs>
-        <w:spacing w:after="240" w:before="240" w:line="240" w:lineRule="auto"/>
-        <w:jc w:val="both"/>
-        <w:rPr>
-          <w:b w:val="1"/>
-          <w:bCs w:val="1"/>
-          <w:sz w:val="24"/>
-          <w:szCs w:val="24"/>
-        </w:rPr>
-      </w:pPr>
-      <w:r>
-        <w:rPr>
-          <w:b w:val="1"/>
-          <w:bCs w:val="1"/>
-          <w:sz w:val="24"/>
-          <w:szCs w:val="24"/>
-          <w:rtl w:val="0"/>
-        </w:rPr>
-        <w:t xml:space="preserve">LA NOTARIA,</w:t>
-      </w:r>
-    </w:p>
-    <w:p>
-      <w:pPr>
-        <w:tabs>
-          <w:tab w:val="right" w:leader="none" w:pos="7920"/>
-          <w:tab w:val="left" w:leader="none" w:pos="8784"/>
-        </w:tabs>
-        <w:spacing w:after="240" w:before="240" w:line="240" w:lineRule="auto"/>
-        <w:jc w:val="center"/>
-        <w:rPr>
-          <w:rFonts w:ascii="Pinyon Script" w:cs="Pinyon Script" w:eastAsia="Pinyon Script" w:hAnsi="Pinyon Script"/>
-          <w:b w:val="1"/>
-          <w:bCs w:val="1"/>
-          <w:color w:val="0000cc"/>
-          <w:sz w:val="52"/>
-          <w:szCs w:val="52"/>
-          <w:u w:val="single"/>
-        </w:rPr>
-      </w:pPr>
-      <w:r>
-        <w:rPr>
-          <w:rFonts w:ascii="Pinyon Script" w:cs="Pinyon Script" w:eastAsia="Pinyon Script" w:hAnsi="Pinyon Script"/>
-          <w:b w:val="1"/>
-          <w:bCs w:val="1"/>
-          <w:sz w:val="24"/>
-          <w:szCs w:val="24"/>
-          <w:u w:val="single"/>
-          <w:rtl w:val="0"/>
-        </w:rPr>
-        <w:t xml:space="preserve">​​</w:t>
-      </w:r>
-      <w:r>
-        <w:rPr>
-          <w:rFonts w:ascii="Pinyon Script" w:cs="Pinyon Script" w:eastAsia="Pinyon Script" w:hAnsi="Pinyon Script"/>
-          <w:b w:val="1"/>
-          <w:bCs w:val="1"/>
-          <w:color w:val="0000cc"/>
-          <w:sz w:val="52"/>
-          <w:szCs w:val="52"/>
-          <w:u w:val="single"/>
-          <w:rtl w:val="0"/>
-        </w:rPr>
-        <w:t xml:space="preserve">Margarita López Cely</w:t>
-      </w:r>
-    </w:p>
-    <w:p>
-      <w:pPr>
-        <w:tabs>
-          <w:tab w:val="right" w:leader="none" w:pos="7920"/>
-          <w:tab w:val="left" w:leader="none" w:pos="8784"/>
-        </w:tabs>
-        <w:spacing w:line="240" w:lineRule="auto"/>
-        <w:jc w:val="center"/>
-        <w:rPr>
-          <w:b w:val="1"/>
-          <w:bCs w:val="1"/>
-          <w:color w:val="0000cc"/>
-          <w:sz w:val="20"/>
-          <w:szCs w:val="20"/>
-          <w:u w:val="single"/>
-        </w:rPr>
-      </w:pPr>
-      <w:r>
-        <w:rPr>
-          <w:b w:val="1"/>
-          <w:bCs w:val="1"/>
-          <w:color w:val="0000cc"/>
-          <w:sz w:val="20"/>
-          <w:szCs w:val="20"/>
-          <w:u w:val="single"/>
-          <w:rtl w:val="0"/>
-        </w:rPr>
-        <w:t xml:space="preserve">NOTARIA TERCERA DEL CIRCULO DE BUCARAMANGA</w:t>
       </w:r>
     </w:p>
     <w:p>
@@ -182,6 +56,62 @@
         <w:rPr>
           <w:rtl w:val="0"/>
         </w:rPr>
+      </w:r>
+    </w:p>
+    <w:p>
+      <w:pPr>
+        <w:jc w:val="center"/>
+      </w:pPr>
+      <w:r>
+        <w:rPr>
+          <w:b/>
+          <w:color w:val="1F497D"/>
+          <w:sz w:val="24"/>
+        </w:rPr>
+        <w:t>_________</w:t>
+      </w:r>
+    </w:p>
+    <w:p/>
+    <w:p>
+      <w:pPr>
+        <w:jc w:val="center"/>
+      </w:pPr>
+      <w:r>
+        <w:rPr>
+          <w:b/>
+          <w:color w:val="1F497D"/>
+          <w:sz w:val="28"/>
+        </w:rPr>
+        <w:t>LA NOTARIA,</w:t>
+      </w:r>
+    </w:p>
+    <w:p/>
+    <w:p>
+      <w:pPr>
+        <w:jc w:val="center"/>
+      </w:pPr>
+      <w:r>
+        <w:rPr>
+          <w:b/>
+          <w:i/>
+          <w:color w:val="1F497D"/>
+          <w:sz w:val="32"/>
+        </w:rPr>
+        <w:t>{{NOTARIA_FIRMA_NOMBRE}}</w:t>
+      </w:r>
+    </w:p>
+    <w:p>
+      <w:pPr>
+        <w:jc w:val="center"/>
+      </w:pPr>
+      <w:r>
+        <w:rPr>
+          <w:b/>
+          <w:i/>
+          <w:color w:val="1F497D"/>
+          <w:sz w:val="26"/>
+        </w:rPr>
+        <w:t>{{NOTARIA_CARGO}}</w:t>
       </w:r>
     </w:p>
     <w:sectPr>

</xml_diff>